<commit_message>
before adding cort data
</commit_message>
<xml_diff>
--- a/Notes/representative_traces.docx
+++ b/Notes/representative_traces.docx
@@ -366,6 +366,9 @@
       <w:r>
         <w:rPr>
           <w:rStyle w:val="CommentReference"/>
+          <w:rFonts w:ascii="Times New Roman" w:hAnsi="Times New Roman" w:cs="Times New Roman"/>
+          <w:sz w:val="24"/>
+          <w:szCs w:val="24"/>
         </w:rPr>
         <w:commentReference w:id="0"/>
       </w:r>
@@ -487,23 +490,7 @@
         <w:rPr>
           <w:rFonts w:ascii="Times New Roman" w:hAnsi="Times New Roman" w:cs="Times New Roman"/>
         </w:rPr>
-        <w:t xml:space="preserve">Y: 20 </w:t>
-      </w:r>
-      <w:proofErr w:type="spellStart"/>
-      <w:proofErr w:type="gramStart"/>
-      <w:r>
-        <w:rPr>
-          <w:rFonts w:ascii="Times New Roman" w:hAnsi="Times New Roman" w:cs="Times New Roman"/>
-        </w:rPr>
-        <w:t>pA</w:t>
-      </w:r>
-      <w:proofErr w:type="spellEnd"/>
-      <w:proofErr w:type="gramEnd"/>
-      <w:r>
-        <w:rPr>
-          <w:rFonts w:ascii="Times New Roman" w:hAnsi="Times New Roman" w:cs="Times New Roman"/>
-        </w:rPr>
-        <w:t xml:space="preserve"> for top limit and -</w:t>
+        <w:t>Y: 20 pA for top limit and -</w:t>
       </w:r>
       <w:r>
         <w:rPr>
@@ -515,21 +502,7 @@
         <w:rPr>
           <w:rFonts w:ascii="Times New Roman" w:hAnsi="Times New Roman" w:cs="Times New Roman"/>
         </w:rPr>
-        <w:t xml:space="preserve"> </w:t>
-      </w:r>
-      <w:proofErr w:type="spellStart"/>
-      <w:r>
-        <w:rPr>
-          <w:rFonts w:ascii="Times New Roman" w:hAnsi="Times New Roman" w:cs="Times New Roman"/>
-        </w:rPr>
-        <w:t>pA</w:t>
-      </w:r>
-      <w:proofErr w:type="spellEnd"/>
-      <w:r>
-        <w:rPr>
-          <w:rFonts w:ascii="Times New Roman" w:hAnsi="Times New Roman" w:cs="Times New Roman"/>
-        </w:rPr>
-        <w:t xml:space="preserve"> for bottom</w:t>
+        <w:t xml:space="preserve"> pA for bottom</w:t>
       </w:r>
     </w:p>
     <w:p>
@@ -555,6 +528,19 @@
         <w:rPr>
           <w:rFonts w:ascii="Times New Roman" w:hAnsi="Times New Roman" w:cs="Times New Roman"/>
         </w:rPr>
+        <w:t>Makes an averaged trace (trace 61)</w:t>
+      </w:r>
+    </w:p>
+    <w:p>
+      <w:pPr>
+        <w:rPr>
+          <w:rFonts w:ascii="Times New Roman" w:hAnsi="Times New Roman" w:cs="Times New Roman"/>
+        </w:rPr>
+      </w:pPr>
+      <w:r>
+        <w:rPr>
+          <w:rFonts w:ascii="Times New Roman" w:hAnsi="Times New Roman" w:cs="Times New Roman"/>
+        </w:rPr>
         <w:t xml:space="preserve">Get rid of stim </w:t>
       </w:r>
       <w:r>
@@ -640,21 +626,19 @@
         <w:rPr>
           <w:rFonts w:ascii="Times New Roman" w:hAnsi="Times New Roman" w:cs="Times New Roman"/>
         </w:rPr>
-        <w:t xml:space="preserve"> (will apply the flat before </w:t>
-      </w:r>
-      <w:proofErr w:type="gramStart"/>
-      <w:r>
-        <w:rPr>
-          <w:rFonts w:ascii="Times New Roman" w:hAnsi="Times New Roman" w:cs="Times New Roman"/>
-        </w:rPr>
-        <w:t>stim</w:t>
-      </w:r>
-      <w:proofErr w:type="gramEnd"/>
-      <w:r>
-        <w:rPr>
-          <w:rFonts w:ascii="Times New Roman" w:hAnsi="Times New Roman" w:cs="Times New Roman"/>
-        </w:rPr>
-        <w:t xml:space="preserve"> to the stim)</w:t>
+        <w:t xml:space="preserve"> (will apply the flat before stim to the stim)</w:t>
+      </w:r>
+      <w:r>
+        <w:rPr>
+          <w:rFonts w:ascii="Times New Roman" w:hAnsi="Times New Roman" w:cs="Times New Roman"/>
+        </w:rPr>
+        <w:t>… all visible signals</w:t>
+      </w:r>
+      <w:r>
+        <w:rPr>
+          <w:rFonts w:ascii="Times New Roman" w:hAnsi="Times New Roman" w:cs="Times New Roman"/>
+        </w:rPr>
+        <w:t xml:space="preserve"> and traces</w:t>
       </w:r>
     </w:p>
     <w:p>
@@ -712,33 +696,20 @@
         <w:rPr>
           <w:rFonts w:ascii="Times New Roman" w:hAnsi="Times New Roman" w:cs="Times New Roman"/>
         </w:rPr>
-        <w:t xml:space="preserve">need to keep axes to make scale bar (50 </w:t>
-      </w:r>
-      <w:proofErr w:type="spellStart"/>
-      <w:r>
-        <w:rPr>
-          <w:rFonts w:ascii="Times New Roman" w:hAnsi="Times New Roman" w:cs="Times New Roman"/>
-        </w:rPr>
-        <w:t>pA</w:t>
-      </w:r>
-      <w:proofErr w:type="spellEnd"/>
-      <w:r>
-        <w:rPr>
-          <w:rFonts w:ascii="Times New Roman" w:hAnsi="Times New Roman" w:cs="Times New Roman"/>
-        </w:rPr>
-        <w:t xml:space="preserve"> by 10 msec)</w:t>
-      </w:r>
-    </w:p>
-    <w:p>
-      <w:pPr>
-        <w:rPr>
-          <w:rFonts w:ascii="Times New Roman" w:hAnsi="Times New Roman" w:cs="Times New Roman"/>
-        </w:rPr>
-      </w:pPr>
-      <w:r>
-        <w:rPr>
-          <w:rFonts w:ascii="Times New Roman" w:hAnsi="Times New Roman" w:cs="Times New Roman"/>
-        </w:rPr>
+        <w:t>need to keep axes to make scale bar (50 pA by 10 msec)</w:t>
+      </w:r>
+    </w:p>
+    <w:p>
+      <w:pPr>
+        <w:rPr>
+          <w:rFonts w:ascii="Times New Roman" w:hAnsi="Times New Roman" w:cs="Times New Roman"/>
+        </w:rPr>
+      </w:pPr>
+      <w:r>
+        <w:rPr>
+          <w:rFonts w:ascii="Times New Roman" w:hAnsi="Times New Roman" w:cs="Times New Roman"/>
+        </w:rPr>
+        <w:lastRenderedPageBreak/>
         <w:t xml:space="preserve">On PowerPoint: ungroup </w:t>
       </w:r>
       <w:r>
@@ -764,9 +735,396 @@
         <w:rPr>
           <w:rFonts w:ascii="Times New Roman" w:hAnsi="Times New Roman" w:cs="Times New Roman"/>
         </w:rPr>
-        <w:lastRenderedPageBreak/>
         <w:t xml:space="preserve">Right click -&gt; format shape </w:t>
       </w:r>
+    </w:p>
+    <w:p>
+      <w:pPr>
+        <w:rPr>
+          <w:rFonts w:ascii="Times New Roman" w:hAnsi="Times New Roman" w:cs="Times New Roman"/>
+        </w:rPr>
+      </w:pPr>
+    </w:p>
+    <w:p>
+      <w:pPr>
+        <w:rPr>
+          <w:rFonts w:ascii="Times New Roman" w:hAnsi="Times New Roman" w:cs="Times New Roman"/>
+        </w:rPr>
+      </w:pPr>
+    </w:p>
+    <w:p>
+      <w:pPr>
+        <w:rPr>
+          <w:rFonts w:ascii="Times New Roman" w:hAnsi="Times New Roman" w:cs="Times New Roman"/>
+        </w:rPr>
+      </w:pPr>
+    </w:p>
+    <w:p>
+      <w:pPr>
+        <w:rPr>
+          <w:rFonts w:ascii="Times New Roman" w:hAnsi="Times New Roman" w:cs="Times New Roman"/>
+        </w:rPr>
+      </w:pPr>
+      <w:r>
+        <w:rPr>
+          <w:rFonts w:ascii="Times New Roman" w:hAnsi="Times New Roman" w:cs="Times New Roman"/>
+        </w:rPr>
+        <w:t>INKSCAPE</w:t>
+      </w:r>
+    </w:p>
+    <w:p>
+      <w:pPr>
+        <w:numPr>
+          <w:ilvl w:val="0"/>
+          <w:numId w:val="1"/>
+        </w:numPr>
+        <w:shd w:val="clear" w:color="auto" w:fill="FFFFFF"/>
+        <w:spacing w:before="100" w:beforeAutospacing="1" w:after="100" w:afterAutospacing="1" w:line="240" w:lineRule="auto"/>
+        <w:textAlignment w:val="baseline"/>
+        <w:rPr>
+          <w:rFonts w:ascii="inherit" w:eastAsia="Times New Roman" w:hAnsi="inherit" w:cs="Calibri"/>
+          <w:color w:val="000000"/>
+          <w:kern w:val="0"/>
+          <w14:ligatures w14:val="none"/>
+        </w:rPr>
+      </w:pPr>
+      <w:r>
+        <w:rPr>
+          <w:rFonts w:ascii="inherit" w:eastAsia="Times New Roman" w:hAnsi="inherit" w:cs="Calibri"/>
+          <w:color w:val="000000"/>
+          <w:kern w:val="0"/>
+          <w14:ligatures w14:val="none"/>
+        </w:rPr>
+        <w:t>Export the averaged trace as a metafile and paste it into Inkscape.</w:t>
+      </w:r>
+    </w:p>
+    <w:p>
+      <w:pPr>
+        <w:numPr>
+          <w:ilvl w:val="0"/>
+          <w:numId w:val="1"/>
+        </w:numPr>
+        <w:shd w:val="clear" w:color="auto" w:fill="FFFFFF"/>
+        <w:spacing w:before="100" w:beforeAutospacing="1" w:after="100" w:afterAutospacing="1" w:line="240" w:lineRule="auto"/>
+        <w:textAlignment w:val="baseline"/>
+        <w:rPr>
+          <w:rFonts w:ascii="inherit" w:eastAsia="Times New Roman" w:hAnsi="inherit" w:cs="Calibri"/>
+          <w:color w:val="000000"/>
+          <w:kern w:val="0"/>
+          <w14:ligatures w14:val="none"/>
+        </w:rPr>
+      </w:pPr>
+      <w:r>
+        <w:rPr>
+          <w:rFonts w:ascii="inherit" w:eastAsia="Times New Roman" w:hAnsi="inherit" w:cs="Calibri"/>
+          <w:color w:val="000000"/>
+          <w:kern w:val="0"/>
+          <w14:ligatures w14:val="none"/>
+        </w:rPr>
+        <w:t>Click on View -&gt; Display Mode -&gt; Enhance thin lines (optional, use if the lines aren't easy to see)</w:t>
+      </w:r>
+    </w:p>
+    <w:p>
+      <w:pPr>
+        <w:numPr>
+          <w:ilvl w:val="0"/>
+          <w:numId w:val="1"/>
+        </w:numPr>
+        <w:shd w:val="clear" w:color="auto" w:fill="FFFFFF"/>
+        <w:spacing w:before="100" w:beforeAutospacing="1" w:after="100" w:afterAutospacing="1" w:line="240" w:lineRule="auto"/>
+        <w:textAlignment w:val="baseline"/>
+        <w:rPr>
+          <w:rFonts w:ascii="inherit" w:eastAsia="Times New Roman" w:hAnsi="inherit" w:cs="Calibri"/>
+          <w:color w:val="000000"/>
+          <w:kern w:val="0"/>
+          <w14:ligatures w14:val="none"/>
+        </w:rPr>
+      </w:pPr>
+      <w:r>
+        <w:rPr>
+          <w:rFonts w:ascii="inherit" w:eastAsia="Times New Roman" w:hAnsi="inherit" w:cs="Calibri"/>
+          <w:color w:val="000000"/>
+          <w:kern w:val="0"/>
+          <w14:ligatures w14:val="none"/>
+        </w:rPr>
+        <w:t>Double-click and drag to select in a rectangle shape. Draw this rectangle over the cursor labels and triangles and press "delete" to remove them from the top of the plot.</w:t>
+      </w:r>
+    </w:p>
+    <w:p>
+      <w:pPr>
+        <w:numPr>
+          <w:ilvl w:val="0"/>
+          <w:numId w:val="1"/>
+        </w:numPr>
+        <w:shd w:val="clear" w:color="auto" w:fill="FFFFFF"/>
+        <w:spacing w:before="100" w:beforeAutospacing="1" w:after="100" w:afterAutospacing="1" w:line="240" w:lineRule="auto"/>
+        <w:textAlignment w:val="baseline"/>
+        <w:rPr>
+          <w:rFonts w:ascii="inherit" w:eastAsia="Times New Roman" w:hAnsi="inherit" w:cs="Calibri"/>
+          <w:color w:val="000000"/>
+          <w:kern w:val="0"/>
+          <w14:ligatures w14:val="none"/>
+        </w:rPr>
+      </w:pPr>
+      <w:r>
+        <w:rPr>
+          <w:rFonts w:ascii="inherit" w:eastAsia="Times New Roman" w:hAnsi="inherit" w:cs="Calibri"/>
+          <w:color w:val="000000"/>
+          <w:kern w:val="0"/>
+          <w14:ligatures w14:val="none"/>
+        </w:rPr>
+        <w:t>RUBY: select whole thing -&gt; Path -&gt; Trace Bitmap</w:t>
+      </w:r>
+      <w:r>
+        <w:rPr>
+          <w:rFonts w:ascii="inherit" w:eastAsia="Times New Roman" w:hAnsi="inherit" w:cs="Calibri"/>
+          <w:color w:val="000000"/>
+          <w:kern w:val="0"/>
+          <w14:ligatures w14:val="none"/>
+        </w:rPr>
+        <w:t>, makes a new version you can use</w:t>
+      </w:r>
+    </w:p>
+    <w:p>
+      <w:pPr>
+        <w:numPr>
+          <w:ilvl w:val="0"/>
+          <w:numId w:val="1"/>
+        </w:numPr>
+        <w:shd w:val="clear" w:color="auto" w:fill="FFFFFF"/>
+        <w:spacing w:before="100" w:beforeAutospacing="1" w:after="100" w:afterAutospacing="1" w:line="240" w:lineRule="auto"/>
+        <w:textAlignment w:val="baseline"/>
+        <w:rPr>
+          <w:rFonts w:ascii="inherit" w:eastAsia="Times New Roman" w:hAnsi="inherit" w:cs="Calibri"/>
+          <w:color w:val="000000"/>
+          <w:kern w:val="0"/>
+          <w14:ligatures w14:val="none"/>
+        </w:rPr>
+      </w:pPr>
+      <w:r>
+        <w:rPr>
+          <w:rFonts w:ascii="inherit" w:eastAsia="Times New Roman" w:hAnsi="inherit" w:cs="Calibri"/>
+          <w:color w:val="000000"/>
+          <w:kern w:val="0"/>
+          <w14:ligatures w14:val="none"/>
+        </w:rPr>
+        <w:t>Click on Path -&gt; Path effects. It will open a dialog box with a search box for "Add Live Path Effect". Type in "Simplify"</w:t>
+      </w:r>
+    </w:p>
+    <w:p>
+      <w:pPr>
+        <w:numPr>
+          <w:ilvl w:val="0"/>
+          <w:numId w:val="1"/>
+        </w:numPr>
+        <w:shd w:val="clear" w:color="auto" w:fill="FFFFFF"/>
+        <w:spacing w:before="100" w:beforeAutospacing="1" w:after="100" w:afterAutospacing="1" w:line="240" w:lineRule="auto"/>
+        <w:textAlignment w:val="baseline"/>
+        <w:rPr>
+          <w:rFonts w:ascii="inherit" w:eastAsia="Times New Roman" w:hAnsi="inherit" w:cs="Calibri"/>
+          <w:color w:val="000000"/>
+          <w:kern w:val="0"/>
+          <w14:ligatures w14:val="none"/>
+        </w:rPr>
+      </w:pPr>
+      <w:r>
+        <w:rPr>
+          <w:rFonts w:ascii="inherit" w:eastAsia="Times New Roman" w:hAnsi="inherit" w:cs="Calibri"/>
+          <w:color w:val="000000"/>
+          <w:kern w:val="0"/>
+          <w14:ligatures w14:val="none"/>
+        </w:rPr>
+        <w:t>Complexity: 15, Repeat: 1, Smoothness = 7, Handle size = 0</w:t>
+      </w:r>
+    </w:p>
+    <w:p>
+      <w:pPr>
+        <w:numPr>
+          <w:ilvl w:val="0"/>
+          <w:numId w:val="1"/>
+        </w:numPr>
+        <w:shd w:val="clear" w:color="auto" w:fill="FFFFFF"/>
+        <w:spacing w:before="100" w:beforeAutospacing="1" w:after="100" w:afterAutospacing="1" w:line="240" w:lineRule="auto"/>
+        <w:textAlignment w:val="baseline"/>
+        <w:rPr>
+          <w:rFonts w:ascii="inherit" w:eastAsia="Times New Roman" w:hAnsi="inherit" w:cs="Calibri"/>
+          <w:color w:val="000000"/>
+          <w:kern w:val="0"/>
+          <w14:ligatures w14:val="none"/>
+        </w:rPr>
+      </w:pPr>
+      <w:r>
+        <w:rPr>
+          <w:rFonts w:ascii="inherit" w:eastAsia="Times New Roman" w:hAnsi="inherit" w:cs="Calibri"/>
+          <w:color w:val="000000"/>
+          <w:kern w:val="0"/>
+          <w14:ligatures w14:val="none"/>
+        </w:rPr>
+        <w:t>Convert object to path</w:t>
+      </w:r>
+    </w:p>
+    <w:p>
+      <w:pPr>
+        <w:numPr>
+          <w:ilvl w:val="0"/>
+          <w:numId w:val="1"/>
+        </w:numPr>
+        <w:shd w:val="clear" w:color="auto" w:fill="FFFFFF"/>
+        <w:spacing w:before="100" w:beforeAutospacing="1" w:after="100" w:afterAutospacing="1" w:line="240" w:lineRule="auto"/>
+        <w:textAlignment w:val="baseline"/>
+        <w:rPr>
+          <w:rFonts w:ascii="inherit" w:eastAsia="Times New Roman" w:hAnsi="inherit" w:cs="Calibri"/>
+          <w:color w:val="000000"/>
+          <w:kern w:val="0"/>
+          <w14:ligatures w14:val="none"/>
+        </w:rPr>
+      </w:pPr>
+      <w:r>
+        <w:rPr>
+          <w:rFonts w:ascii="inherit" w:eastAsia="Times New Roman" w:hAnsi="inherit" w:cs="Calibri"/>
+          <w:color w:val="000000"/>
+          <w:kern w:val="0"/>
+          <w14:ligatures w14:val="none"/>
+        </w:rPr>
+        <w:t>Add a scale bar, using the original axis that came with the plot.</w:t>
+      </w:r>
+    </w:p>
+    <w:p>
+      <w:pPr>
+        <w:numPr>
+          <w:ilvl w:val="0"/>
+          <w:numId w:val="1"/>
+        </w:numPr>
+        <w:shd w:val="clear" w:color="auto" w:fill="FFFFFF"/>
+        <w:spacing w:before="100" w:beforeAutospacing="1" w:after="100" w:afterAutospacing="1" w:line="240" w:lineRule="auto"/>
+        <w:textAlignment w:val="baseline"/>
+        <w:rPr>
+          <w:rFonts w:ascii="inherit" w:eastAsia="Times New Roman" w:hAnsi="inherit" w:cs="Calibri"/>
+          <w:color w:val="000000"/>
+          <w:kern w:val="0"/>
+          <w14:ligatures w14:val="none"/>
+        </w:rPr>
+      </w:pPr>
+      <w:r>
+        <w:rPr>
+          <w:rFonts w:ascii="inherit" w:eastAsia="Times New Roman" w:hAnsi="inherit" w:cs="Calibri"/>
+          <w:color w:val="000000"/>
+          <w:kern w:val="0"/>
+          <w14:ligatures w14:val="none"/>
+        </w:rPr>
+        <w:t>Select everything (trace, scale bar and axes) and decrease the selection width by roughly 50%</w:t>
+      </w:r>
+    </w:p>
+    <w:p>
+      <w:pPr>
+        <w:numPr>
+          <w:ilvl w:val="0"/>
+          <w:numId w:val="1"/>
+        </w:numPr>
+        <w:shd w:val="clear" w:color="auto" w:fill="FFFFFF"/>
+        <w:spacing w:before="100" w:beforeAutospacing="1" w:after="100" w:afterAutospacing="1" w:line="240" w:lineRule="auto"/>
+        <w:textAlignment w:val="baseline"/>
+        <w:rPr>
+          <w:rFonts w:ascii="inherit" w:eastAsia="Times New Roman" w:hAnsi="inherit" w:cs="Calibri"/>
+          <w:color w:val="000000"/>
+          <w:kern w:val="0"/>
+          <w14:ligatures w14:val="none"/>
+        </w:rPr>
+      </w:pPr>
+      <w:r>
+        <w:rPr>
+          <w:rFonts w:ascii="inherit" w:eastAsia="Times New Roman" w:hAnsi="inherit" w:cs="Calibri"/>
+          <w:color w:val="000000"/>
+          <w:kern w:val="0"/>
+          <w14:ligatures w14:val="none"/>
+        </w:rPr>
+        <w:t>Click on the red trace and press the "n" key (or choose the Node tool). You should see a lot of grey diamonds appear. Double-click, squeeze, and drag to create a rectangle and select some nodes. Click the "delete" key to remove these points. You can quickly trim off the start and end of the trace with two clicks.</w:t>
+      </w:r>
+    </w:p>
+    <w:p>
+      <w:pPr>
+        <w:numPr>
+          <w:ilvl w:val="0"/>
+          <w:numId w:val="1"/>
+        </w:numPr>
+        <w:shd w:val="clear" w:color="auto" w:fill="FFFFFF"/>
+        <w:spacing w:before="100" w:beforeAutospacing="1" w:after="100" w:afterAutospacing="1" w:line="240" w:lineRule="auto"/>
+        <w:textAlignment w:val="baseline"/>
+        <w:rPr>
+          <w:rFonts w:ascii="inherit" w:eastAsia="Times New Roman" w:hAnsi="inherit" w:cs="Calibri"/>
+          <w:color w:val="000000"/>
+          <w:kern w:val="0"/>
+          <w14:ligatures w14:val="none"/>
+        </w:rPr>
+      </w:pPr>
+      <w:r>
+        <w:rPr>
+          <w:rFonts w:ascii="inherit" w:eastAsia="Times New Roman" w:hAnsi="inherit" w:cs="Calibri"/>
+          <w:color w:val="000000"/>
+          <w:kern w:val="0"/>
+          <w14:ligatures w14:val="none"/>
+        </w:rPr>
+        <w:t>Sometimes I apply smoothing again, or use Ctrl + L for the "Simplify" option (I don't use this as often because sometimes it smooths the curve too much, reducing the amplitude).</w:t>
+      </w:r>
+    </w:p>
+    <w:p>
+      <w:pPr>
+        <w:numPr>
+          <w:ilvl w:val="0"/>
+          <w:numId w:val="1"/>
+        </w:numPr>
+        <w:shd w:val="clear" w:color="auto" w:fill="FFFFFF"/>
+        <w:spacing w:before="100" w:beforeAutospacing="1" w:after="100" w:afterAutospacing="1" w:line="240" w:lineRule="auto"/>
+        <w:textAlignment w:val="baseline"/>
+        <w:rPr>
+          <w:rFonts w:ascii="inherit" w:eastAsia="Times New Roman" w:hAnsi="inherit" w:cs="Calibri"/>
+          <w:color w:val="000000"/>
+          <w:kern w:val="0"/>
+          <w14:ligatures w14:val="none"/>
+        </w:rPr>
+      </w:pPr>
+      <w:r>
+        <w:rPr>
+          <w:rFonts w:ascii="inherit" w:eastAsia="Times New Roman" w:hAnsi="inherit" w:cs="Calibri"/>
+          <w:color w:val="000000"/>
+          <w:kern w:val="0"/>
+          <w14:ligatures w14:val="none"/>
+        </w:rPr>
+        <w:t>Click on Object -&gt; Fill and Stroke to open a dialog box to customize the fill and stroke colours. In the Stroke style box, I also increase the stroke width to 4.174 px.</w:t>
+      </w:r>
+    </w:p>
+    <w:p>
+      <w:pPr>
+        <w:numPr>
+          <w:ilvl w:val="0"/>
+          <w:numId w:val="1"/>
+        </w:numPr>
+        <w:shd w:val="clear" w:color="auto" w:fill="FFFFFF"/>
+        <w:spacing w:before="100" w:beforeAutospacing="1" w:after="100" w:afterAutospacing="1" w:line="240" w:lineRule="auto"/>
+        <w:textAlignment w:val="baseline"/>
+        <w:rPr>
+          <w:rFonts w:ascii="inherit" w:eastAsia="Times New Roman" w:hAnsi="inherit" w:cs="Calibri"/>
+          <w:color w:val="000000"/>
+          <w:kern w:val="0"/>
+          <w14:ligatures w14:val="none"/>
+        </w:rPr>
+      </w:pPr>
+      <w:r>
+        <w:rPr>
+          <w:rFonts w:ascii="inherit" w:eastAsia="Times New Roman" w:hAnsi="inherit" w:cs="Calibri"/>
+          <w:color w:val="000000"/>
+          <w:kern w:val="0"/>
+          <w14:ligatures w14:val="none"/>
+        </w:rPr>
+        <w:t>Add text annotations (I am using Segoe UI with a Bold effect)</w:t>
+      </w:r>
+    </w:p>
+    <w:p>
+      <w:pPr>
+        <w:rPr>
+          <w:rFonts w:ascii="Times New Roman" w:hAnsi="Times New Roman" w:cs="Times New Roman"/>
+        </w:rPr>
+      </w:pPr>
     </w:p>
     <w:sectPr>
       <w:pgSz w:w="12240" w:h="15840"/>
@@ -816,6 +1174,127 @@
 <w16cid:commentsIds xmlns:wpc="http://schemas.microsoft.com/office/word/2010/wordprocessingCanvas" xmlns:cx="http://schemas.microsoft.com/office/drawing/2014/chartex" xmlns:cx1="http://schemas.microsoft.com/office/drawing/2015/9/8/chartex" xmlns:cx2="http://schemas.microsoft.com/office/drawing/2015/10/21/chartex" xmlns:cx3="http://schemas.microsoft.com/office/drawing/2016/5/9/chartex" xmlns:cx4="http://schemas.microsoft.com/office/drawing/2016/5/10/chartex" xmlns:cx5="http://schemas.microsoft.com/office/drawing/2016/5/11/chartex" xmlns:cx6="http://schemas.microsoft.com/office/drawing/2016/5/12/chartex" xmlns:cx7="http://schemas.microsoft.com/office/drawing/2016/5/13/chartex" xmlns:cx8="http://schemas.microsoft.com/office/drawing/2016/5/14/chartex" xmlns:mc="http://schemas.openxmlformats.org/markup-compatibility/2006" xmlns:aink="http://schemas.microsoft.com/office/drawing/2016/ink" xmlns:am3d="http://schemas.microsoft.com/office/drawing/2017/model3d" xmlns:o="urn:schemas-microsoft-com:office:office" xmlns:oel="http://schemas.microsoft.com/office/2019/extlst" xmlns:r="http://schemas.openxmlformats.org/officeDocument/2006/relationships" xmlns:m="http://schemas.openxmlformats.org/officeDocument/2006/math" xmlns:v="urn:schemas-microsoft-com:vml" xmlns:wp14="http://schemas.microsoft.com/office/word/2010/wordprocessingDrawing" xmlns:wp="http://schemas.openxmlformats.org/drawingml/2006/wordprocessingDrawing" xmlns:w10="urn:schemas-microsoft-com:office:word" xmlns:w="http://schemas.openxmlformats.org/wordprocessingml/2006/main" xmlns:w14="http://schemas.microsoft.com/office/word/2010/wordml" xmlns:w15="http://schemas.microsoft.com/office/word/2012/wordml" xmlns:w16cex="http://schemas.microsoft.com/office/word/2018/wordml/cex" xmlns:w16cid="http://schemas.microsoft.com/office/word/2016/wordml/cid" xmlns:w16="http://schemas.microsoft.com/office/word/2018/wordml" xmlns:w16du="http://schemas.microsoft.com/office/word/2023/wordml/word16du" xmlns:w16sdtdh="http://schemas.microsoft.com/office/word/2020/wordml/sdtdatahash" xmlns:w16sdtfl="http://schemas.microsoft.com/office/word/2024/wordml/sdtformatlock" xmlns:w16se="http://schemas.microsoft.com/office/word/2015/wordml/symex" xmlns:wpg="http://schemas.microsoft.com/office/word/2010/wordprocessingGroup" xmlns:wpi="http://schemas.microsoft.com/office/word/2010/wordprocessingInk" xmlns:wne="http://schemas.microsoft.com/office/word/2006/wordml" xmlns:wps="http://schemas.microsoft.com/office/word/2010/wordprocessingShape" mc:Ignorable="w14 w15 w16se w16cid w16 w16cex w16sdtdh w16sdtfl w16du wp14">
   <w16cid:commentId w16cid:paraId="74A92346" w16cid:durableId="0B2DD434"/>
 </w16cid:commentsIds>
+</file>
+
+<file path=word/numbering.xml><?xml version="1.0" encoding="utf-8"?>
+<w:numbering xmlns:wpc="http://schemas.microsoft.com/office/word/2010/wordprocessingCanvas" xmlns:cx="http://schemas.microsoft.com/office/drawing/2014/chartex" xmlns:cx1="http://schemas.microsoft.com/office/drawing/2015/9/8/chartex" xmlns:cx2="http://schemas.microsoft.com/office/drawing/2015/10/21/chartex" xmlns:cx3="http://schemas.microsoft.com/office/drawing/2016/5/9/chartex" xmlns:cx4="http://schemas.microsoft.com/office/drawing/2016/5/10/chartex" xmlns:cx5="http://schemas.microsoft.com/office/drawing/2016/5/11/chartex" xmlns:cx6="http://schemas.microsoft.com/office/drawing/2016/5/12/chartex" xmlns:cx7="http://schemas.microsoft.com/office/drawing/2016/5/13/chartex" xmlns:cx8="http://schemas.microsoft.com/office/drawing/2016/5/14/chartex" xmlns:mc="http://schemas.openxmlformats.org/markup-compatibility/2006" xmlns:aink="http://schemas.microsoft.com/office/drawing/2016/ink" xmlns:am3d="http://schemas.microsoft.com/office/drawing/2017/model3d" xmlns:o="urn:schemas-microsoft-com:office:office" xmlns:oel="http://schemas.microsoft.com/office/2019/extlst" xmlns:r="http://schemas.openxmlformats.org/officeDocument/2006/relationships" xmlns:m="http://schemas.openxmlformats.org/officeDocument/2006/math" xmlns:v="urn:schemas-microsoft-com:vml" xmlns:wp14="http://schemas.microsoft.com/office/word/2010/wordprocessingDrawing" xmlns:wp="http://schemas.openxmlformats.org/drawingml/2006/wordprocessingDrawing" xmlns:w10="urn:schemas-microsoft-com:office:word" xmlns:w="http://schemas.openxmlformats.org/wordprocessingml/2006/main" xmlns:w14="http://schemas.microsoft.com/office/word/2010/wordml" xmlns:w15="http://schemas.microsoft.com/office/word/2012/wordml" xmlns:w16cex="http://schemas.microsoft.com/office/word/2018/wordml/cex" xmlns:w16cid="http://schemas.microsoft.com/office/word/2016/wordml/cid" xmlns:w16="http://schemas.microsoft.com/office/word/2018/wordml" xmlns:w16du="http://schemas.microsoft.com/office/word/2023/wordml/word16du" xmlns:w16sdtdh="http://schemas.microsoft.com/office/word/2020/wordml/sdtdatahash" xmlns:w16sdtfl="http://schemas.microsoft.com/office/word/2024/wordml/sdtformatlock" xmlns:w16se="http://schemas.microsoft.com/office/word/2015/wordml/symex" xmlns:wpg="http://schemas.microsoft.com/office/word/2010/wordprocessingGroup" xmlns:wpi="http://schemas.microsoft.com/office/word/2010/wordprocessingInk" xmlns:wne="http://schemas.microsoft.com/office/word/2006/wordml" xmlns:wps="http://schemas.microsoft.com/office/word/2010/wordprocessingShape" mc:Ignorable="w14 w15 w16se w16cid w16 w16cex w16sdtdh w16sdtfl w16du wp14">
+  <w:abstractNum w:abstractNumId="0" w15:restartNumberingAfterBreak="0">
+    <w:nsid w:val="576162E7"/>
+    <w:multiLevelType w:val="multilevel"/>
+    <w:tmpl w:val="57FCD07E"/>
+    <w:lvl w:ilvl="0">
+      <w:start w:val="1"/>
+      <w:numFmt w:val="decimal"/>
+      <w:lvlText w:val="%1."/>
+      <w:lvlJc w:val="left"/>
+      <w:pPr>
+        <w:tabs>
+          <w:tab w:val="num" w:pos="720"/>
+        </w:tabs>
+        <w:ind w:left="720" w:hanging="360"/>
+      </w:pPr>
+    </w:lvl>
+    <w:lvl w:ilvl="1">
+      <w:start w:val="1"/>
+      <w:numFmt w:val="decimal"/>
+      <w:lvlText w:val="%2."/>
+      <w:lvlJc w:val="left"/>
+      <w:pPr>
+        <w:tabs>
+          <w:tab w:val="num" w:pos="1440"/>
+        </w:tabs>
+        <w:ind w:left="1440" w:hanging="360"/>
+      </w:pPr>
+    </w:lvl>
+    <w:lvl w:ilvl="2" w:tentative="1">
+      <w:start w:val="1"/>
+      <w:numFmt w:val="decimal"/>
+      <w:lvlText w:val="%3."/>
+      <w:lvlJc w:val="left"/>
+      <w:pPr>
+        <w:tabs>
+          <w:tab w:val="num" w:pos="2160"/>
+        </w:tabs>
+        <w:ind w:left="2160" w:hanging="360"/>
+      </w:pPr>
+    </w:lvl>
+    <w:lvl w:ilvl="3" w:tentative="1">
+      <w:start w:val="1"/>
+      <w:numFmt w:val="decimal"/>
+      <w:lvlText w:val="%4."/>
+      <w:lvlJc w:val="left"/>
+      <w:pPr>
+        <w:tabs>
+          <w:tab w:val="num" w:pos="2880"/>
+        </w:tabs>
+        <w:ind w:left="2880" w:hanging="360"/>
+      </w:pPr>
+    </w:lvl>
+    <w:lvl w:ilvl="4" w:tentative="1">
+      <w:start w:val="1"/>
+      <w:numFmt w:val="decimal"/>
+      <w:lvlText w:val="%5."/>
+      <w:lvlJc w:val="left"/>
+      <w:pPr>
+        <w:tabs>
+          <w:tab w:val="num" w:pos="3600"/>
+        </w:tabs>
+        <w:ind w:left="3600" w:hanging="360"/>
+      </w:pPr>
+    </w:lvl>
+    <w:lvl w:ilvl="5" w:tentative="1">
+      <w:start w:val="1"/>
+      <w:numFmt w:val="decimal"/>
+      <w:lvlText w:val="%6."/>
+      <w:lvlJc w:val="left"/>
+      <w:pPr>
+        <w:tabs>
+          <w:tab w:val="num" w:pos="4320"/>
+        </w:tabs>
+        <w:ind w:left="4320" w:hanging="360"/>
+      </w:pPr>
+    </w:lvl>
+    <w:lvl w:ilvl="6" w:tentative="1">
+      <w:start w:val="1"/>
+      <w:numFmt w:val="decimal"/>
+      <w:lvlText w:val="%7."/>
+      <w:lvlJc w:val="left"/>
+      <w:pPr>
+        <w:tabs>
+          <w:tab w:val="num" w:pos="5040"/>
+        </w:tabs>
+        <w:ind w:left="5040" w:hanging="360"/>
+      </w:pPr>
+    </w:lvl>
+    <w:lvl w:ilvl="7" w:tentative="1">
+      <w:start w:val="1"/>
+      <w:numFmt w:val="decimal"/>
+      <w:lvlText w:val="%8."/>
+      <w:lvlJc w:val="left"/>
+      <w:pPr>
+        <w:tabs>
+          <w:tab w:val="num" w:pos="5760"/>
+        </w:tabs>
+        <w:ind w:left="5760" w:hanging="360"/>
+      </w:pPr>
+    </w:lvl>
+    <w:lvl w:ilvl="8" w:tentative="1">
+      <w:start w:val="1"/>
+      <w:numFmt w:val="decimal"/>
+      <w:lvlText w:val="%9."/>
+      <w:lvlJc w:val="left"/>
+      <w:pPr>
+        <w:tabs>
+          <w:tab w:val="num" w:pos="6480"/>
+        </w:tabs>
+        <w:ind w:left="6480" w:hanging="360"/>
+      </w:pPr>
+    </w:lvl>
+  </w:abstractNum>
+  <w:num w:numId="1" w16cid:durableId="322052724">
+    <w:abstractNumId w:val="0"/>
+  </w:num>
+</w:numbering>
 </file>
 
 <file path=word/people.xml><?xml version="1.0" encoding="utf-8"?>

</xml_diff>